<commit_message>
EricMarcon published a site update
</commit_message>
<xml_diff>
--- a/Rev1.docx
+++ b/Rev1.docx
@@ -4099,7 +4099,7 @@
         <w:t xml:space="preserve">In this section, we investigate these two potential limitations.</w:t>
       </w:r>
     </w:p>
-    <w:bookmarkStart w:id="34" w:name="computing-time"/>
+    <w:bookmarkStart w:id="38" w:name="computing-time"/>
     <w:p>
       <w:pPr>
         <w:pStyle w:val="Titre3"/>
@@ -4194,7 +4194,7 @@
         <w:t xml:space="preserve"> </w:t>
       </w:r>
       <w:r>
-        <w:t xml:space="preserve">0.99) using the mentioned relation:</w:t>
+        <w:t xml:space="preserve">0.97) using the mentioned relation:</w:t>
       </w:r>
       <w:r>
         <w:t xml:space="preserve"> </w:t>
@@ -4290,7 +4290,7 @@
         </m:r>
       </m:oMath>
       <w:r>
-        <w:t xml:space="preserve"> points (e.g., 2.99 seconds for 100,000 points), knowing the time</w:t>
+        <w:t xml:space="preserve"> points (e.g., 2.59 seconds for 100,000 points), knowing the time</w:t>
       </w:r>
       <w:r>
         <w:t xml:space="preserve"> </w:t>
@@ -4350,22 +4350,12 @@
         <w:t xml:space="preserve"> </w:t>
       </w:r>
       <w:r>
-        <w:t xml:space="preserve">is the power relation (here: 1.5).</w:t>
-      </w:r>
-    </w:p>
-    <w:bookmarkEnd w:id="34"/>
-    <w:bookmarkStart w:id="39" w:name="memory"/>
-    <w:p>
-      <w:pPr>
-        <w:pStyle w:val="Titre3"/>
-      </w:pPr>
-      <w:r>
-        <w:t xml:space="preserve">Memory</w:t>
-      </w:r>
-    </w:p>
-    <w:p>
-      <w:pPr>
-        <w:pStyle w:val="FirstParagraph"/>
+        <w:t xml:space="preserve">is the power relation (here: 1.3).</w:t>
+      </w:r>
+    </w:p>
+    <w:p>
+      <w:pPr>
+        <w:pStyle w:val="Corpsdetexte"/>
       </w:pPr>
     </w:p>
     <w:p>
@@ -4377,18 +4367,18 @@
           <wp:inline>
             <wp:extent cx="4620126" cy="2310063"/>
             <wp:effectExtent b="0" l="0" r="0" t="0"/>
-            <wp:docPr descr="Figure 4: (a) Calculation time (seconds) and (b) memory required (MB) to estimate M as a function of the size of the set of points. The measures were repeated 10 times. The bars represent the \pm 1 standard deviation interval." title="" id="36" name="Picture"/>
+            <wp:docPr descr="Figure 4: (a) Calculation time (seconds) and (b) memory required (MB) to estimate M as a function of the size of the set of points. The measures were repeated 10 times. The bars represent the +/- 1 standard deviation interval." title="" id="35" name="Picture"/>
             <a:graphic>
               <a:graphicData uri="http://schemas.openxmlformats.org/drawingml/2006/picture">
                 <pic:pic>
                   <pic:nvPicPr>
-                    <pic:cNvPr descr="Rev1_files/Rev1_files/figure-docx/TestTimeMemFig-1.png" id="37" name="Picture"/>
+                    <pic:cNvPr descr="Rev1_files/Rev1_files/figure-docx/TestTimeMemFig-1.png" id="36" name="Picture"/>
                     <pic:cNvPicPr>
                       <a:picLocks noChangeArrowheads="1" noChangeAspect="1"/>
                     </pic:cNvPicPr>
                   </pic:nvPicPr>
                   <pic:blipFill>
-                    <a:blip r:embed="rId35"/>
+                    <a:blip r:embed="rId34"/>
                     <a:stretch>
                       <a:fillRect/>
                     </a:stretch>
@@ -4419,8 +4409,8 @@
       <w:pPr>
         <w:pStyle w:val="ImageCaption"/>
       </w:pPr>
-      <w:bookmarkStart w:id="38" w:name="fig:TestTimeMemFig"/>
-      <w:bookmarkEnd w:id="38"/>
+      <w:bookmarkStart w:id="37" w:name="fig:TestTimeMemFig"/>
+      <w:bookmarkEnd w:id="37"/>
       <w:r>
         <w:t xml:space="preserve">Figure 4: (a) Calculation time (seconds) and (b) memory required (MB) to estimate </w:t>
       </w:r>
@@ -4435,24 +4425,7 @@
         <w:t xml:space="preserve"> </w:t>
       </w:r>
       <w:r>
-        <w:t xml:space="preserve">as a function of the size of the set of points. The measures were repeated 10 times. The bars represent the </w:t>
-      </w:r>
-      <m:oMath>
-        <m:r>
-          <m:rPr>
-            <m:sty m:val="p"/>
-          </m:rPr>
-          <m:t>±</m:t>
-        </m:r>
-        <m:r>
-          <m:t>1</m:t>
-        </m:r>
-      </m:oMath>
-      <w:r>
-        <w:t xml:space="preserve"> </w:t>
-      </w:r>
-      <w:r>
-        <w:t xml:space="preserve">standard deviation interval.</w:t>
+        <w:t xml:space="preserve">as a function of the size of the set of points. The measures were repeated 10 times. The bars represent the +/- 1 standard deviation interval.</w:t>
       </w:r>
     </w:p>
     <w:p>
@@ -4460,9 +4433,19 @@
         <w:pStyle w:val="Corpsdetexte"/>
       </w:pPr>
     </w:p>
-    <w:p>
-      <w:pPr>
-        <w:pStyle w:val="Corpsdetexte"/>
+    <w:bookmarkEnd w:id="38"/>
+    <w:bookmarkStart w:id="39" w:name="memory"/>
+    <w:p>
+      <w:pPr>
+        <w:pStyle w:val="Titre3"/>
+      </w:pPr>
+      <w:r>
+        <w:t xml:space="preserve">Memory</w:t>
+      </w:r>
+    </w:p>
+    <w:p>
+      <w:pPr>
+        <w:pStyle w:val="FirstParagraph"/>
       </w:pPr>
       <w:r>
         <w:t xml:space="preserve">The memory used is evaluated for the same data sizes (Figure </w:t>
@@ -5729,13 +5712,13 @@
         <w:t xml:space="preserve"> </w:t>
       </w:r>
       <w:r>
-        <w:t xml:space="preserve">For a set of five million points, the power law predicts around 13 minutes of computing time.</w:t>
-      </w:r>
-      <w:r>
-        <w:t xml:space="preserve"> </w:t>
-      </w:r>
-      <w:r>
-        <w:t xml:space="preserve">Accordingly, 1,000 simulations would take around 9 days.</w:t>
+        <w:t xml:space="preserve">For a set of five million points, the power law predicts around 5 minutes of computing time.</w:t>
+      </w:r>
+      <w:r>
+        <w:t xml:space="preserve"> </w:t>
+      </w:r>
+      <w:r>
+        <w:t xml:space="preserve">Accordingly, 1,000 simulations would take around 4 days.</w:t>
       </w:r>
     </w:p>
     <w:p>

</xml_diff>

<commit_message>
FlorencePuech published a site update
</commit_message>
<xml_diff>
--- a/Rev1.docx
+++ b/Rev1.docx
@@ -7,7 +7,7 @@
         <w:pStyle w:val="Date"/>
       </w:pPr>
       <w:r>
-        <w:t xml:space="preserve">June 03, 2026</w:t>
+        <w:t xml:space="preserve">June 06, 2026</w:t>
       </w:r>
     </w:p>
     <w:p>
@@ -445,7 +445,7 @@
         <w:t xml:space="preserve"> </w:t>
       </w:r>
       <w:r>
-        <w:t xml:space="preserve">Loonis &amp; Bellefon (2018)</w:t>
+        <w:t xml:space="preserve">Floch et al. (2018)</w:t>
       </w:r>
       <w:r>
         <w:t xml:space="preserve"> </w:t>
@@ -4176,7 +4176,7 @@
         <w:t xml:space="preserve"> </w:t>
       </w:r>
       <w:r>
-        <w:t xml:space="preserve">0.97) using the mentioned relation:</w:t>
+        <w:t xml:space="preserve">0.99) using the mentioned relation:</w:t>
       </w:r>
       <w:r>
         <w:t xml:space="preserve"> </w:t>
@@ -4272,7 +4272,7 @@
         </m:r>
       </m:oMath>
       <w:r>
-        <w:t xml:space="preserve"> points (e.g., 2.52 seconds for 100,000 points), knowing the time</w:t>
+        <w:t xml:space="preserve"> points (e.g., 2.47 seconds for 100,000 points), knowing the time</w:t>
       </w:r>
       <w:r>
         <w:t xml:space="preserve"> </w:t>
@@ -6389,7 +6389,16 @@
         <w:pStyle w:val="Bibliographie"/>
       </w:pPr>
       <w:r>
-        <w:t xml:space="preserve">Barff, R. A. (1987). Industrial clustering and the organization of production: A point pattern analysis of manufacturing in cincinnati, ohio.</w:t>
+        <w:t xml:space="preserve">Barff, R. A. (1987).</w:t>
+      </w:r>
+      <w:r>
+        <w:t xml:space="preserve"> </w:t>
+      </w:r>
+      <w:r>
+        <w:t xml:space="preserve">Industrial Clustering and the Organization of Production: A Point Pattern Analysis of Manufacturing in Cincinnati, Ohio</w:t>
+      </w:r>
+      <w:r>
+        <w:t xml:space="preserve">.</w:t>
       </w:r>
       <w:r>
         <w:t xml:space="preserve"> </w:t>
@@ -6506,7 +6515,16 @@
         <w:pStyle w:val="Bibliographie"/>
       </w:pPr>
       <w:r>
-        <w:t xml:space="preserve">Brülhart, M., &amp; Traeger, R. (2005). An account of geographic concentration patterns in europe.</w:t>
+        <w:t xml:space="preserve">Brülhart, M., &amp; Traeger, R. (2005). An account of geographic concentration patterns in</w:t>
+      </w:r>
+      <w:r>
+        <w:t xml:space="preserve"> </w:t>
+      </w:r>
+      <w:r>
+        <w:t xml:space="preserve">E</w:t>
+      </w:r>
+      <w:r>
+        <w:t xml:space="preserve">urope.</w:t>
       </w:r>
       <w:r>
         <w:t xml:space="preserve"> </w:t>
@@ -6954,7 +6972,16 @@
         <w:pStyle w:val="Bibliographie"/>
       </w:pPr>
       <w:r>
-        <w:t xml:space="preserve">Ellison, G., &amp; Glaeser, E. L. (1997). Geographic concentration in u.s. Manufacturing industries: A dartboard approach.</w:t>
+        <w:t xml:space="preserve">Ellison, G., &amp; Glaeser, E. L. (1997).</w:t>
+      </w:r>
+      <w:r>
+        <w:t xml:space="preserve"> </w:t>
+      </w:r>
+      <w:r>
+        <w:t xml:space="preserve">Geographic Concentration in U.S. Manufacturing Industries: A Dartboard Approach</w:t>
+      </w:r>
+      <w:r>
+        <w:t xml:space="preserve">.</w:t>
       </w:r>
       <w:r>
         <w:t xml:space="preserve"> </w:t>
@@ -7125,16 +7152,59 @@
         <w:t xml:space="preserve">Industrial location economics</w:t>
       </w:r>
       <w:r>
-        <w:t xml:space="preserve">. Edward Elgar Publishing.</w:t>
+        <w:t xml:space="preserve"> </w:t>
+      </w:r>
+      <w:r>
+        <w:t xml:space="preserve">(pp. 222–257). Edward Elgar Publishing.</w:t>
       </w:r>
     </w:p>
     <w:bookmarkEnd w:id="94"/>
-    <w:bookmarkStart w:id="95" w:name="ref-Florence1972"/>
+    <w:bookmarkStart w:id="95" w:name="ref-Floch2018"/>
     <w:p>
       <w:pPr>
         <w:pStyle w:val="Bibliographie"/>
       </w:pPr>
       <w:r>
+        <w:t xml:space="preserve">Floch, J.-M., Marcon, E., &amp; Puech, F. (2018). Spatial distribution of points. In V. Loonis &amp; M.-P. de Bellefon (Eds),</w:t>
+      </w:r>
+      <w:r>
+        <w:t xml:space="preserve"> </w:t>
+      </w:r>
+      <w:r>
+        <w:rPr>
+          <w:i/>
+          <w:iCs/>
+        </w:rPr>
+        <w:t xml:space="preserve">Handbook of spatial analysis, theory and application with</w:t>
+      </w:r>
+      <w:r>
+        <w:rPr>
+          <w:i/>
+          <w:iCs/>
+        </w:rPr>
+        <w:t xml:space="preserve"> </w:t>
+      </w:r>
+      <w:r>
+        <w:rPr>
+          <w:i/>
+          <w:iCs/>
+        </w:rPr>
+        <w:t xml:space="preserve">R</w:t>
+      </w:r>
+      <w:r>
+        <w:t xml:space="preserve"> </w:t>
+      </w:r>
+      <w:r>
+        <w:t xml:space="preserve">(pp. 71–111). Insee-Eurostat.</w:t>
+      </w:r>
+    </w:p>
+    <w:bookmarkEnd w:id="95"/>
+    <w:bookmarkStart w:id="96" w:name="ref-Florence1972"/>
+    <w:p>
+      <w:pPr>
+        <w:pStyle w:val="Bibliographie"/>
+      </w:pPr>
+      <w:r>
         <w:t xml:space="preserve">Florence, P. S. (1972).</w:t>
       </w:r>
       <w:r>
@@ -7154,8 +7224,8 @@
         <w:t xml:space="preserve">(3rd edn). Routledge &amp; Kegan Paul.</w:t>
       </w:r>
     </w:p>
-    <w:bookmarkEnd w:id="95"/>
-    <w:bookmarkStart w:id="96" w:name="ref-Fujita1999"/>
+    <w:bookmarkEnd w:id="96"/>
+    <w:bookmarkStart w:id="97" w:name="ref-Fujita1999"/>
     <w:p>
       <w:pPr>
         <w:pStyle w:val="Bibliographie"/>
@@ -7177,8 +7247,8 @@
         <w:t xml:space="preserve">. The MIT Press.</w:t>
       </w:r>
     </w:p>
-    <w:bookmarkEnd w:id="96"/>
-    <w:bookmarkStart w:id="97" w:name="ref-Fujita2013"/>
+    <w:bookmarkEnd w:id="97"/>
+    <w:bookmarkStart w:id="98" w:name="ref-Fujita2013"/>
     <w:p>
       <w:pPr>
         <w:pStyle w:val="Bibliographie"/>
@@ -7203,8 +7273,8 @@
         <w:t xml:space="preserve">(2nd edn). Cambridge University Press.</w:t>
       </w:r>
     </w:p>
-    <w:bookmarkEnd w:id="97"/>
-    <w:bookmarkStart w:id="98" w:name="ref-Gini1912"/>
+    <w:bookmarkEnd w:id="98"/>
+    <w:bookmarkStart w:id="99" w:name="ref-Gini1912"/>
     <w:p>
       <w:pPr>
         <w:pStyle w:val="Bibliographie"/>
@@ -7266,8 +7336,8 @@
         <w:t xml:space="preserve">di Cagliari.</w:t>
       </w:r>
     </w:p>
-    <w:bookmarkEnd w:id="98"/>
-    <w:bookmarkStart w:id="99" w:name="ref-Giuliani2014"/>
+    <w:bookmarkEnd w:id="99"/>
+    <w:bookmarkStart w:id="100" w:name="ref-Giuliani2014"/>
     <w:p>
       <w:pPr>
         <w:pStyle w:val="Bibliographie"/>
@@ -7311,8 +7381,8 @@
         <w:t xml:space="preserve">(3), 251–272.</w:t>
       </w:r>
     </w:p>
-    <w:bookmarkEnd w:id="99"/>
-    <w:bookmarkStart w:id="100" w:name="ref-Glaeser2010"/>
+    <w:bookmarkEnd w:id="100"/>
+    <w:bookmarkStart w:id="101" w:name="ref-Glaeser2010"/>
     <w:p>
       <w:pPr>
         <w:pStyle w:val="Bibliographie"/>
@@ -7334,8 +7404,8 @@
         <w:t xml:space="preserve">. National Bureau of Economic Research, University of Chicago Press.</w:t>
       </w:r>
     </w:p>
-    <w:bookmarkEnd w:id="100"/>
-    <w:bookmarkStart w:id="102" w:name="ref-Jensen2011"/>
+    <w:bookmarkEnd w:id="101"/>
+    <w:bookmarkStart w:id="103" w:name="ref-Jensen2011"/>
     <w:p>
       <w:pPr>
         <w:pStyle w:val="Bibliographie"/>
@@ -7372,7 +7442,7 @@
       <w:r>
         <w:t xml:space="preserve"> </w:t>
       </w:r>
-      <w:hyperlink r:id="rId101">
+      <w:hyperlink r:id="rId102">
         <w:r>
           <w:rPr>
             <w:rStyle w:val="Lienhypertexte"/>
@@ -7381,8 +7451,8 @@
         </w:r>
       </w:hyperlink>
     </w:p>
-    <w:bookmarkEnd w:id="102"/>
-    <w:bookmarkStart w:id="103" w:name="ref-Kerr2015"/>
+    <w:bookmarkEnd w:id="103"/>
+    <w:bookmarkStart w:id="104" w:name="ref-Kerr2015"/>
     <w:p>
       <w:pPr>
         <w:pStyle w:val="Bibliographie"/>
@@ -7417,8 +7487,8 @@
         <w:t xml:space="preserve">(4), 877–899.</w:t>
       </w:r>
     </w:p>
-    <w:bookmarkEnd w:id="103"/>
-    <w:bookmarkStart w:id="105" w:name="ref-Lentz2011"/>
+    <w:bookmarkEnd w:id="104"/>
+    <w:bookmarkStart w:id="106" w:name="ref-Lentz2011"/>
     <w:p>
       <w:pPr>
         <w:pStyle w:val="Bibliographie"/>
@@ -7470,7 +7540,7 @@
       <w:r>
         <w:t xml:space="preserve"> </w:t>
       </w:r>
-      <w:hyperlink r:id="rId104">
+      <w:hyperlink r:id="rId105">
         <w:r>
           <w:rPr>
             <w:rStyle w:val="Lienhypertexte"/>
@@ -7478,46 +7548,6 @@
           <w:t xml:space="preserve">https://doi.org/10.1371/journal.pone.0021830</w:t>
         </w:r>
       </w:hyperlink>
-    </w:p>
-    <w:bookmarkEnd w:id="105"/>
-    <w:bookmarkStart w:id="106" w:name="ref-Floch2018"/>
-    <w:p>
-      <w:pPr>
-        <w:pStyle w:val="Bibliographie"/>
-      </w:pPr>
-      <w:r>
-        <w:t xml:space="preserve">Loonis, V., &amp; Bellefon, M.-P. de (Eds). (2018). Spatial distribution of points. In</w:t>
-      </w:r>
-      <w:r>
-        <w:t xml:space="preserve"> </w:t>
-      </w:r>
-      <w:r>
-        <w:rPr>
-          <w:i/>
-          <w:iCs/>
-        </w:rPr>
-        <w:t xml:space="preserve">Handbook of spatial analysis, theory and application with</w:t>
-      </w:r>
-      <w:r>
-        <w:rPr>
-          <w:i/>
-          <w:iCs/>
-        </w:rPr>
-        <w:t xml:space="preserve"> </w:t>
-      </w:r>
-      <w:r>
-        <w:rPr>
-          <w:i/>
-          <w:iCs/>
-        </w:rPr>
-        <w:t xml:space="preserve">R</w:t>
-      </w:r>
-      <w:r>
-        <w:t xml:space="preserve"> </w:t>
-      </w:r>
-      <w:r>
-        <w:t xml:space="preserve">(pp. 71–111). Insee-Eurostat.</w:t>
-      </w:r>
     </w:p>
     <w:bookmarkEnd w:id="106"/>
     <w:bookmarkStart w:id="107" w:name="ref-Marcon2019"/>

</xml_diff>